<commit_message>
Changes in DIPS and EFT
</commit_message>
<xml_diff>
--- a/datasheet_gen/word_templates/EFT.docx
+++ b/datasheet_gen/word_templates/EFT.docx
@@ -1299,9 +1299,8 @@
             <w:vAlign w:val="center"/>
           </w:tcPr>
           <w:p>
-            <w:r/>
             <w:r>
-              <w:t>{{ immunity_test_requirement }}</w:t>
+              <w:t xml:space="preserve">{{r immunity_test_requirement }}</w:t>
             </w:r>
           </w:p>
         </w:tc>
@@ -1338,9 +1337,8 @@
             <w:vAlign w:val="center"/>
           </w:tcPr>
           <w:p>
-            <w:r/>
             <w:r>
-              <w:t>{{ number_of_test_ports_col_1 }}</w:t>
+              <w:t xml:space="preserve">{{r test_port_power }}</w:t>
             </w:r>
           </w:p>
         </w:tc>
@@ -1350,9 +1348,8 @@
             <w:vAlign w:val="center"/>
           </w:tcPr>
           <w:p>
-            <w:r/>
             <w:r>
-              <w:t>{{ number_of_test_ports_col_2 }}</w:t>
+              <w:t xml:space="preserve">{{r test_port_signal }}</w:t>
             </w:r>
           </w:p>
         </w:tc>
@@ -1389,9 +1386,8 @@
             <w:vAlign w:val="center"/>
           </w:tcPr>
           <w:p>
-            <w:r/>
             <w:r>
-              <w:t>{{ test_voltage_col_1 }}</w:t>
+              <w:t xml:space="preserve">{{r test_voltage_power_line }}</w:t>
             </w:r>
           </w:p>
         </w:tc>
@@ -1401,9 +1397,8 @@
             <w:vAlign w:val="center"/>
           </w:tcPr>
           <w:p>
-            <w:r/>
             <w:r>
-              <w:t>{{ test_voltage_col_2 }}</w:t>
+              <w:t xml:space="preserve">{{r test_voltage_signal_line }}</w:t>
             </w:r>
           </w:p>
         </w:tc>
@@ -1633,9 +1628,8 @@
             <w:vAlign w:val="center"/>
           </w:tcPr>
           <w:p>
-            <w:r/>
             <w:r>
-              <w:t>{{ pulse_repetition_frequency }}</w:t>
+              <w:t xml:space="preserve">{{r pulse_repetition_frequency }}</w:t>
             </w:r>
           </w:p>
         </w:tc>
@@ -1830,9 +1824,8 @@
             <w:vAlign w:val="center"/>
           </w:tcPr>
           <w:p>
-            <w:r/>
             <w:r>
-              <w:t>{{ eut_configuration_col_1 }}</w:t>
+              <w:t xml:space="preserve">{{r eut_configuration }}</w:t>
             </w:r>
           </w:p>
         </w:tc>
@@ -1842,9 +1835,8 @@
             <w:vAlign w:val="center"/>
           </w:tcPr>
           <w:p>
-            <w:r/>
             <w:r>
-              <w:t>{{ eut_configuration_col_2 }}</w:t>
+              <w:t xml:space="preserve">{{r eut_configuration }}</w:t>
             </w:r>
           </w:p>
         </w:tc>
@@ -2254,1070 +2246,6 @@
         </w:rPr>
       </w:pPr>
     </w:p>
-    <w:tbl>
-      <w:tblPr>
-        <w:tblStyle w:val="TableGrid"/>
-        <w:tblW w:w="0" w:type="auto"/>
-        <w:tblLook w:val="04A0" w:firstRow="1" w:lastRow="0" w:firstColumn="1" w:lastColumn="0" w:noHBand="0" w:noVBand="1"/>
-      </w:tblPr>
-      <w:tblGrid>
-        <w:gridCol w:w="2524"/>
-        <w:gridCol w:w="811"/>
-        <w:gridCol w:w="812"/>
-        <w:gridCol w:w="811"/>
-        <w:gridCol w:w="812"/>
-        <w:gridCol w:w="811"/>
-        <w:gridCol w:w="812"/>
-        <w:gridCol w:w="811"/>
-        <w:gridCol w:w="812"/>
-      </w:tblGrid>
-      <w:tr>
-        <w:trPr>
-          <w:trHeight w:val="283"/>
-        </w:trPr>
-        <w:tc>
-          <w:tcPr>
-            <w:tcW w:w="2524" w:type="dxa"/>
-            <w:vMerge w:val="restart"/>
-            <w:vAlign w:val="center"/>
-          </w:tcPr>
-          <w:p>
-            <w:pPr>
-              <w:jc w:val="center"/>
-              <w:rPr>
-                <w:rFonts w:ascii="Arial" w:hAnsi="Arial" w:cs="Arial"/>
-                <w:b/>
-                <w:bCs/>
-                <w:lang w:val="en-US"/>
-              </w:rPr>
-            </w:pPr>
-            <w:r>
-              <w:rPr>
-                <w:rFonts w:ascii="Arial" w:hAnsi="Arial" w:cs="Arial"/>
-                <w:b/>
-                <w:bCs/>
-                <w:lang w:val="en-US"/>
-              </w:rPr>
-              <w:t>Coupling path / line</w:t>
-            </w:r>
-          </w:p>
-        </w:tc>
-        <w:tc>
-          <w:tcPr>
-            <w:tcW w:w="6492" w:type="dxa"/>
-            <w:gridSpan w:val="8"/>
-            <w:vAlign w:val="center"/>
-          </w:tcPr>
-          <w:p>
-            <w:pPr>
-              <w:jc w:val="center"/>
-              <w:rPr>
-                <w:rFonts w:ascii="Arial" w:hAnsi="Arial" w:cs="Arial"/>
-                <w:b/>
-                <w:bCs/>
-                <w:lang w:val="en-US"/>
-              </w:rPr>
-            </w:pPr>
-            <w:r>
-              <w:rPr>
-                <w:rFonts w:ascii="Arial" w:hAnsi="Arial" w:cs="Arial"/>
-                <w:b/>
-                <w:bCs/>
-                <w:lang w:val="en-US"/>
-              </w:rPr>
-              <w:t>Test Level (kV)</w:t>
-            </w:r>
-          </w:p>
-        </w:tc>
-      </w:tr>
-      <w:tr>
-        <w:trPr>
-          <w:trHeight w:val="283"/>
-        </w:trPr>
-        <w:tc>
-          <w:tcPr>
-            <w:tcW w:w="2524" w:type="dxa"/>
-            <w:vMerge/>
-            <w:vAlign w:val="center"/>
-          </w:tcPr>
-          <w:p>
-            <w:pPr>
-              <w:jc w:val="center"/>
-              <w:rPr>
-                <w:rFonts w:ascii="Arial" w:hAnsi="Arial" w:cs="Arial"/>
-                <w:b/>
-                <w:bCs/>
-                <w:lang w:val="en-US"/>
-              </w:rPr>
-            </w:pPr>
-          </w:p>
-        </w:tc>
-        <w:tc>
-          <w:tcPr>
-            <w:tcW w:w="811" w:type="dxa"/>
-            <w:vAlign w:val="center"/>
-          </w:tcPr>
-          <w:p>
-            <w:pPr>
-              <w:jc w:val="center"/>
-              <w:rPr>
-                <w:rFonts w:ascii="Arial" w:hAnsi="Arial" w:cs="Arial"/>
-                <w:b/>
-                <w:bCs/>
-                <w:lang w:val="en-US"/>
-              </w:rPr>
-            </w:pPr>
-            <w:r>
-              <w:rPr>
-                <w:rFonts w:ascii="Arial" w:hAnsi="Arial" w:cs="Arial"/>
-                <w:b/>
-                <w:bCs/>
-                <w:lang w:val="en-US"/>
-              </w:rPr>
-              <w:t>+0.5</w:t>
-            </w:r>
-          </w:p>
-        </w:tc>
-        <w:tc>
-          <w:tcPr>
-            <w:tcW w:w="812" w:type="dxa"/>
-            <w:vAlign w:val="center"/>
-          </w:tcPr>
-          <w:p>
-            <w:r/>
-            <w:r>
-              <w:t>{{ coupling_path_line_0_5_col_2 }}</w:t>
-            </w:r>
-          </w:p>
-        </w:tc>
-        <w:tc>
-          <w:tcPr>
-            <w:tcW w:w="811" w:type="dxa"/>
-            <w:vAlign w:val="center"/>
-          </w:tcPr>
-          <w:p>
-            <w:r/>
-            <w:r>
-              <w:t>{{ coupling_path_line_0_5_col_3 }}</w:t>
-            </w:r>
-          </w:p>
-        </w:tc>
-        <w:tc>
-          <w:tcPr>
-            <w:tcW w:w="812" w:type="dxa"/>
-            <w:vAlign w:val="center"/>
-          </w:tcPr>
-          <w:p>
-            <w:r/>
-            <w:r>
-              <w:t>{{ coupling_path_line_0_5_col_4 }}</w:t>
-            </w:r>
-          </w:p>
-        </w:tc>
-        <w:tc>
-          <w:tcPr>
-            <w:tcW w:w="811" w:type="dxa"/>
-            <w:vAlign w:val="center"/>
-          </w:tcPr>
-          <w:p>
-            <w:r/>
-            <w:r>
-              <w:t>{{ coupling_path_line_0_5_col_5 }}</w:t>
-            </w:r>
-          </w:p>
-        </w:tc>
-        <w:tc>
-          <w:tcPr>
-            <w:tcW w:w="812" w:type="dxa"/>
-            <w:vAlign w:val="center"/>
-          </w:tcPr>
-          <w:p>
-            <w:r/>
-            <w:r>
-              <w:t>{{ coupling_path_line_0_5_col_6 }}</w:t>
-            </w:r>
-          </w:p>
-        </w:tc>
-        <w:tc>
-          <w:tcPr>
-            <w:tcW w:w="811" w:type="dxa"/>
-            <w:vAlign w:val="center"/>
-          </w:tcPr>
-          <w:p>
-            <w:r/>
-            <w:r>
-              <w:t>{{ coupling_path_line_0_5_col_7 }}</w:t>
-            </w:r>
-          </w:p>
-        </w:tc>
-        <w:tc>
-          <w:tcPr>
-            <w:tcW w:w="812" w:type="dxa"/>
-            <w:vAlign w:val="center"/>
-          </w:tcPr>
-          <w:p>
-            <w:r/>
-            <w:r>
-              <w:t>{{ coupling_path_line_0_5_col_8 }}</w:t>
-            </w:r>
-          </w:p>
-        </w:tc>
-      </w:tr>
-      <w:tr>
-        <w:trPr>
-          <w:trHeight w:val="283"/>
-        </w:trPr>
-        <w:tc>
-          <w:tcPr>
-            <w:tcW w:w="2524" w:type="dxa"/>
-            <w:vAlign w:val="center"/>
-          </w:tcPr>
-          <w:p>
-            <w:pPr>
-              <w:rPr>
-                <w:rFonts w:ascii="Arial" w:hAnsi="Arial" w:cs="Arial"/>
-                <w:lang w:val="en-US"/>
-              </w:rPr>
-            </w:pPr>
-            <w:r>
-              <w:rPr>
-                <w:rFonts w:ascii="Arial" w:hAnsi="Arial" w:cs="Arial"/>
-                <w:lang w:val="en-US"/>
-              </w:rPr>
-              <w:t>L1</w:t>
-            </w:r>
-          </w:p>
-        </w:tc>
-        <w:tc>
-          <w:tcPr>
-            <w:tcW w:w="811" w:type="dxa"/>
-            <w:vAlign w:val="center"/>
-          </w:tcPr>
-          <w:p>
-            <w:r/>
-            <w:r>
-              <w:t>{{ l1_col_1 }}</w:t>
-            </w:r>
-          </w:p>
-        </w:tc>
-        <w:tc>
-          <w:tcPr>
-            <w:tcW w:w="812" w:type="dxa"/>
-            <w:vAlign w:val="center"/>
-          </w:tcPr>
-          <w:p>
-            <w:r/>
-            <w:r>
-              <w:t>{{ l1_col_2 }}</w:t>
-            </w:r>
-          </w:p>
-        </w:tc>
-        <w:tc>
-          <w:tcPr>
-            <w:tcW w:w="811" w:type="dxa"/>
-            <w:vAlign w:val="center"/>
-          </w:tcPr>
-          <w:p>
-            <w:r/>
-            <w:r>
-              <w:t>{{ l1_col_3 }}</w:t>
-            </w:r>
-          </w:p>
-        </w:tc>
-        <w:tc>
-          <w:tcPr>
-            <w:tcW w:w="812" w:type="dxa"/>
-            <w:vAlign w:val="center"/>
-          </w:tcPr>
-          <w:p>
-            <w:r/>
-            <w:r>
-              <w:t>{{ l1_col_4 }}</w:t>
-            </w:r>
-          </w:p>
-        </w:tc>
-        <w:tc>
-          <w:tcPr>
-            <w:tcW w:w="811" w:type="dxa"/>
-            <w:vAlign w:val="center"/>
-          </w:tcPr>
-          <w:p>
-            <w:r/>
-            <w:r>
-              <w:t>{{ l1_col_5 }}</w:t>
-            </w:r>
-          </w:p>
-        </w:tc>
-        <w:tc>
-          <w:tcPr>
-            <w:tcW w:w="812" w:type="dxa"/>
-            <w:vAlign w:val="center"/>
-          </w:tcPr>
-          <w:p>
-            <w:r/>
-            <w:r>
-              <w:t>{{ l1_col_6 }}</w:t>
-            </w:r>
-          </w:p>
-        </w:tc>
-        <w:tc>
-          <w:tcPr>
-            <w:tcW w:w="811" w:type="dxa"/>
-            <w:vAlign w:val="center"/>
-          </w:tcPr>
-          <w:p>
-            <w:r/>
-            <w:r>
-              <w:t>{{ l1_col_7 }}</w:t>
-            </w:r>
-          </w:p>
-        </w:tc>
-        <w:tc>
-          <w:tcPr>
-            <w:tcW w:w="812" w:type="dxa"/>
-            <w:vAlign w:val="center"/>
-          </w:tcPr>
-          <w:p>
-            <w:r/>
-            <w:r>
-              <w:t>{{ l1_col_8 }}</w:t>
-            </w:r>
-          </w:p>
-        </w:tc>
-      </w:tr>
-      <w:tr>
-        <w:trPr>
-          <w:trHeight w:val="283"/>
-        </w:trPr>
-        <w:tc>
-          <w:tcPr>
-            <w:tcW w:w="2524" w:type="dxa"/>
-            <w:vAlign w:val="center"/>
-          </w:tcPr>
-          <w:p>
-            <w:pPr>
-              <w:rPr>
-                <w:rFonts w:ascii="Arial" w:hAnsi="Arial" w:cs="Arial"/>
-                <w:lang w:val="en-US"/>
-              </w:rPr>
-            </w:pPr>
-            <w:r>
-              <w:rPr>
-                <w:rFonts w:ascii="Arial" w:hAnsi="Arial" w:cs="Arial"/>
-                <w:lang w:val="en-US"/>
-              </w:rPr>
-              <w:t>N</w:t>
-            </w:r>
-          </w:p>
-        </w:tc>
-        <w:tc>
-          <w:tcPr>
-            <w:tcW w:w="811" w:type="dxa"/>
-            <w:vAlign w:val="center"/>
-          </w:tcPr>
-          <w:p>
-            <w:r/>
-            <w:r>
-              <w:t>{{ n_col_1 }}</w:t>
-            </w:r>
-          </w:p>
-        </w:tc>
-        <w:tc>
-          <w:tcPr>
-            <w:tcW w:w="812" w:type="dxa"/>
-            <w:vAlign w:val="center"/>
-          </w:tcPr>
-          <w:p>
-            <w:r/>
-            <w:r>
-              <w:t>{{ n_col_2 }}</w:t>
-            </w:r>
-          </w:p>
-        </w:tc>
-        <w:tc>
-          <w:tcPr>
-            <w:tcW w:w="811" w:type="dxa"/>
-            <w:vAlign w:val="center"/>
-          </w:tcPr>
-          <w:p>
-            <w:r/>
-            <w:r>
-              <w:t>{{ n_col_3 }}</w:t>
-            </w:r>
-          </w:p>
-        </w:tc>
-        <w:tc>
-          <w:tcPr>
-            <w:tcW w:w="812" w:type="dxa"/>
-            <w:vAlign w:val="center"/>
-          </w:tcPr>
-          <w:p>
-            <w:r/>
-            <w:r>
-              <w:t>{{ n_col_4 }}</w:t>
-            </w:r>
-          </w:p>
-        </w:tc>
-        <w:tc>
-          <w:tcPr>
-            <w:tcW w:w="811" w:type="dxa"/>
-            <w:vAlign w:val="center"/>
-          </w:tcPr>
-          <w:p>
-            <w:r/>
-            <w:r>
-              <w:t>{{ n_col_5 }}</w:t>
-            </w:r>
-          </w:p>
-        </w:tc>
-        <w:tc>
-          <w:tcPr>
-            <w:tcW w:w="812" w:type="dxa"/>
-            <w:vAlign w:val="center"/>
-          </w:tcPr>
-          <w:p>
-            <w:r/>
-            <w:r>
-              <w:t>{{ n_col_6 }}</w:t>
-            </w:r>
-          </w:p>
-        </w:tc>
-        <w:tc>
-          <w:tcPr>
-            <w:tcW w:w="811" w:type="dxa"/>
-            <w:vAlign w:val="center"/>
-          </w:tcPr>
-          <w:p>
-            <w:r/>
-            <w:r>
-              <w:t>{{ n_col_7 }}</w:t>
-            </w:r>
-          </w:p>
-        </w:tc>
-        <w:tc>
-          <w:tcPr>
-            <w:tcW w:w="812" w:type="dxa"/>
-            <w:vAlign w:val="center"/>
-          </w:tcPr>
-          <w:p>
-            <w:r/>
-            <w:r>
-              <w:t>{{ n_col_8 }}</w:t>
-            </w:r>
-          </w:p>
-        </w:tc>
-      </w:tr>
-      <w:tr>
-        <w:trPr>
-          <w:trHeight w:val="283"/>
-        </w:trPr>
-        <w:tc>
-          <w:tcPr>
-            <w:tcW w:w="2524" w:type="dxa"/>
-            <w:vAlign w:val="center"/>
-          </w:tcPr>
-          <w:p>
-            <w:pPr>
-              <w:rPr>
-                <w:rFonts w:ascii="Arial" w:hAnsi="Arial" w:cs="Arial"/>
-                <w:lang w:val="en-US"/>
-              </w:rPr>
-            </w:pPr>
-            <w:r>
-              <w:rPr>
-                <w:rFonts w:ascii="Arial" w:hAnsi="Arial" w:cs="Arial"/>
-                <w:lang w:val="en-US"/>
-              </w:rPr>
-              <w:t>PE</w:t>
-            </w:r>
-          </w:p>
-        </w:tc>
-        <w:tc>
-          <w:tcPr>
-            <w:tcW w:w="811" w:type="dxa"/>
-            <w:vAlign w:val="center"/>
-          </w:tcPr>
-          <w:p>
-            <w:r/>
-            <w:r>
-              <w:t>{{ pe_col_1 }}</w:t>
-            </w:r>
-          </w:p>
-        </w:tc>
-        <w:tc>
-          <w:tcPr>
-            <w:tcW w:w="812" w:type="dxa"/>
-            <w:vAlign w:val="center"/>
-          </w:tcPr>
-          <w:p>
-            <w:r/>
-            <w:r>
-              <w:t>{{ pe_col_2 }}</w:t>
-            </w:r>
-          </w:p>
-        </w:tc>
-        <w:tc>
-          <w:tcPr>
-            <w:tcW w:w="811" w:type="dxa"/>
-            <w:vAlign w:val="center"/>
-          </w:tcPr>
-          <w:p>
-            <w:r/>
-            <w:r>
-              <w:t>{{ pe_col_3 }}</w:t>
-            </w:r>
-          </w:p>
-        </w:tc>
-        <w:tc>
-          <w:tcPr>
-            <w:tcW w:w="812" w:type="dxa"/>
-            <w:vAlign w:val="center"/>
-          </w:tcPr>
-          <w:p>
-            <w:r/>
-            <w:r>
-              <w:t>{{ pe_col_4 }}</w:t>
-            </w:r>
-          </w:p>
-        </w:tc>
-        <w:tc>
-          <w:tcPr>
-            <w:tcW w:w="811" w:type="dxa"/>
-            <w:vAlign w:val="center"/>
-          </w:tcPr>
-          <w:p>
-            <w:r/>
-            <w:r>
-              <w:t>{{ pe_col_5 }}</w:t>
-            </w:r>
-          </w:p>
-        </w:tc>
-        <w:tc>
-          <w:tcPr>
-            <w:tcW w:w="812" w:type="dxa"/>
-            <w:vAlign w:val="center"/>
-          </w:tcPr>
-          <w:p>
-            <w:r/>
-            <w:r>
-              <w:t>{{ pe_col_6 }}</w:t>
-            </w:r>
-          </w:p>
-        </w:tc>
-        <w:tc>
-          <w:tcPr>
-            <w:tcW w:w="811" w:type="dxa"/>
-            <w:vAlign w:val="center"/>
-          </w:tcPr>
-          <w:p>
-            <w:r/>
-            <w:r>
-              <w:t>{{ pe_col_7 }}</w:t>
-            </w:r>
-          </w:p>
-        </w:tc>
-        <w:tc>
-          <w:tcPr>
-            <w:tcW w:w="812" w:type="dxa"/>
-            <w:vAlign w:val="center"/>
-          </w:tcPr>
-          <w:p>
-            <w:r/>
-            <w:r>
-              <w:t>{{ pe_col_8 }}</w:t>
-            </w:r>
-          </w:p>
-        </w:tc>
-      </w:tr>
-      <w:tr>
-        <w:trPr>
-          <w:trHeight w:val="283"/>
-        </w:trPr>
-        <w:tc>
-          <w:tcPr>
-            <w:tcW w:w="2524" w:type="dxa"/>
-            <w:vAlign w:val="center"/>
-          </w:tcPr>
-          <w:p>
-            <w:pPr>
-              <w:rPr>
-                <w:rFonts w:ascii="Arial" w:hAnsi="Arial" w:cs="Arial"/>
-                <w:lang w:val="en-US"/>
-              </w:rPr>
-            </w:pPr>
-            <w:r>
-              <w:rPr>
-                <w:rFonts w:ascii="Arial" w:hAnsi="Arial" w:cs="Arial"/>
-                <w:lang w:val="en-US"/>
-              </w:rPr>
-              <w:t>L1+N</w:t>
-            </w:r>
-          </w:p>
-        </w:tc>
-        <w:tc>
-          <w:tcPr>
-            <w:tcW w:w="811" w:type="dxa"/>
-            <w:vAlign w:val="center"/>
-          </w:tcPr>
-          <w:p>
-            <w:r/>
-            <w:r>
-              <w:t>{{ l1_n_col_1 }}</w:t>
-            </w:r>
-          </w:p>
-        </w:tc>
-        <w:tc>
-          <w:tcPr>
-            <w:tcW w:w="812" w:type="dxa"/>
-            <w:vAlign w:val="center"/>
-          </w:tcPr>
-          <w:p>
-            <w:r/>
-            <w:r>
-              <w:t>{{ l1_n_col_2 }}</w:t>
-            </w:r>
-          </w:p>
-        </w:tc>
-        <w:tc>
-          <w:tcPr>
-            <w:tcW w:w="811" w:type="dxa"/>
-            <w:vAlign w:val="center"/>
-          </w:tcPr>
-          <w:p>
-            <w:r/>
-            <w:r>
-              <w:t>{{ l1_n_col_3 }}</w:t>
-            </w:r>
-          </w:p>
-        </w:tc>
-        <w:tc>
-          <w:tcPr>
-            <w:tcW w:w="812" w:type="dxa"/>
-            <w:vAlign w:val="center"/>
-          </w:tcPr>
-          <w:p>
-            <w:r/>
-            <w:r>
-              <w:t>{{ l1_n_col_4 }}</w:t>
-            </w:r>
-          </w:p>
-        </w:tc>
-        <w:tc>
-          <w:tcPr>
-            <w:tcW w:w="811" w:type="dxa"/>
-            <w:vAlign w:val="center"/>
-          </w:tcPr>
-          <w:p>
-            <w:r/>
-            <w:r>
-              <w:t>{{ l1_n_col_5 }}</w:t>
-            </w:r>
-          </w:p>
-        </w:tc>
-        <w:tc>
-          <w:tcPr>
-            <w:tcW w:w="812" w:type="dxa"/>
-            <w:vAlign w:val="center"/>
-          </w:tcPr>
-          <w:p>
-            <w:r/>
-            <w:r>
-              <w:t>{{ l1_n_col_6 }}</w:t>
-            </w:r>
-          </w:p>
-        </w:tc>
-        <w:tc>
-          <w:tcPr>
-            <w:tcW w:w="811" w:type="dxa"/>
-            <w:vAlign w:val="center"/>
-          </w:tcPr>
-          <w:p>
-            <w:r/>
-            <w:r>
-              <w:t>{{ l1_n_col_7 }}</w:t>
-            </w:r>
-          </w:p>
-        </w:tc>
-        <w:tc>
-          <w:tcPr>
-            <w:tcW w:w="812" w:type="dxa"/>
-            <w:vAlign w:val="center"/>
-          </w:tcPr>
-          <w:p>
-            <w:r/>
-            <w:r>
-              <w:t>{{ l1_n_col_8 }}</w:t>
-            </w:r>
-          </w:p>
-        </w:tc>
-      </w:tr>
-      <w:tr>
-        <w:trPr>
-          <w:trHeight w:val="283"/>
-        </w:trPr>
-        <w:tc>
-          <w:tcPr>
-            <w:tcW w:w="2524" w:type="dxa"/>
-            <w:vAlign w:val="center"/>
-          </w:tcPr>
-          <w:p>
-            <w:pPr>
-              <w:rPr>
-                <w:rFonts w:ascii="Arial" w:hAnsi="Arial" w:cs="Arial"/>
-                <w:lang w:val="en-US"/>
-              </w:rPr>
-            </w:pPr>
-            <w:r>
-              <w:rPr>
-                <w:rFonts w:ascii="Arial" w:hAnsi="Arial" w:cs="Arial"/>
-                <w:lang w:val="en-US"/>
-              </w:rPr>
-              <w:t>L1+PE</w:t>
-            </w:r>
-          </w:p>
-        </w:tc>
-        <w:tc>
-          <w:tcPr>
-            <w:tcW w:w="811" w:type="dxa"/>
-            <w:vAlign w:val="center"/>
-          </w:tcPr>
-          <w:p>
-            <w:r/>
-            <w:r>
-              <w:t>{{ l1_pe_col_1 }}</w:t>
-            </w:r>
-          </w:p>
-        </w:tc>
-        <w:tc>
-          <w:tcPr>
-            <w:tcW w:w="812" w:type="dxa"/>
-            <w:vAlign w:val="center"/>
-          </w:tcPr>
-          <w:p>
-            <w:r/>
-            <w:r>
-              <w:t>{{ l1_pe_col_2 }}</w:t>
-            </w:r>
-          </w:p>
-        </w:tc>
-        <w:tc>
-          <w:tcPr>
-            <w:tcW w:w="811" w:type="dxa"/>
-            <w:vAlign w:val="center"/>
-          </w:tcPr>
-          <w:p>
-            <w:r/>
-            <w:r>
-              <w:t>{{ l1_pe_col_3 }}</w:t>
-            </w:r>
-          </w:p>
-        </w:tc>
-        <w:tc>
-          <w:tcPr>
-            <w:tcW w:w="812" w:type="dxa"/>
-            <w:vAlign w:val="center"/>
-          </w:tcPr>
-          <w:p>
-            <w:r/>
-            <w:r>
-              <w:t>{{ l1_pe_col_4 }}</w:t>
-            </w:r>
-          </w:p>
-        </w:tc>
-        <w:tc>
-          <w:tcPr>
-            <w:tcW w:w="811" w:type="dxa"/>
-            <w:vAlign w:val="center"/>
-          </w:tcPr>
-          <w:p>
-            <w:r/>
-            <w:r>
-              <w:t>{{ l1_pe_col_5 }}</w:t>
-            </w:r>
-          </w:p>
-        </w:tc>
-        <w:tc>
-          <w:tcPr>
-            <w:tcW w:w="812" w:type="dxa"/>
-            <w:vAlign w:val="center"/>
-          </w:tcPr>
-          <w:p>
-            <w:r/>
-            <w:r>
-              <w:t>{{ l1_pe_col_6 }}</w:t>
-            </w:r>
-          </w:p>
-        </w:tc>
-        <w:tc>
-          <w:tcPr>
-            <w:tcW w:w="811" w:type="dxa"/>
-            <w:vAlign w:val="center"/>
-          </w:tcPr>
-          <w:p>
-            <w:r/>
-            <w:r>
-              <w:t>{{ l1_pe_col_7 }}</w:t>
-            </w:r>
-          </w:p>
-        </w:tc>
-        <w:tc>
-          <w:tcPr>
-            <w:tcW w:w="812" w:type="dxa"/>
-            <w:vAlign w:val="center"/>
-          </w:tcPr>
-          <w:p>
-            <w:r/>
-            <w:r>
-              <w:t>{{ l1_pe_col_8 }}</w:t>
-            </w:r>
-          </w:p>
-        </w:tc>
-      </w:tr>
-      <w:tr>
-        <w:trPr>
-          <w:trHeight w:val="283"/>
-        </w:trPr>
-        <w:tc>
-          <w:tcPr>
-            <w:tcW w:w="2524" w:type="dxa"/>
-            <w:vAlign w:val="center"/>
-          </w:tcPr>
-          <w:p>
-            <w:pPr>
-              <w:rPr>
-                <w:rFonts w:ascii="Arial" w:hAnsi="Arial" w:cs="Arial"/>
-                <w:lang w:val="en-US"/>
-              </w:rPr>
-            </w:pPr>
-            <w:r>
-              <w:rPr>
-                <w:rFonts w:ascii="Arial" w:hAnsi="Arial" w:cs="Arial"/>
-                <w:lang w:val="en-US"/>
-              </w:rPr>
-              <w:t>N+PE</w:t>
-            </w:r>
-          </w:p>
-        </w:tc>
-        <w:tc>
-          <w:tcPr>
-            <w:tcW w:w="811" w:type="dxa"/>
-            <w:vAlign w:val="center"/>
-          </w:tcPr>
-          <w:p>
-            <w:r/>
-            <w:r>
-              <w:t>{{ n_pe_col_1 }}</w:t>
-            </w:r>
-          </w:p>
-        </w:tc>
-        <w:tc>
-          <w:tcPr>
-            <w:tcW w:w="812" w:type="dxa"/>
-            <w:vAlign w:val="center"/>
-          </w:tcPr>
-          <w:p>
-            <w:r/>
-            <w:r>
-              <w:t>{{ n_pe_col_2 }}</w:t>
-            </w:r>
-          </w:p>
-        </w:tc>
-        <w:tc>
-          <w:tcPr>
-            <w:tcW w:w="811" w:type="dxa"/>
-            <w:vAlign w:val="center"/>
-          </w:tcPr>
-          <w:p>
-            <w:r/>
-            <w:r>
-              <w:t>{{ n_pe_col_3 }}</w:t>
-            </w:r>
-          </w:p>
-        </w:tc>
-        <w:tc>
-          <w:tcPr>
-            <w:tcW w:w="812" w:type="dxa"/>
-            <w:vAlign w:val="center"/>
-          </w:tcPr>
-          <w:p>
-            <w:r/>
-            <w:r>
-              <w:t>{{ n_pe_col_4 }}</w:t>
-            </w:r>
-          </w:p>
-        </w:tc>
-        <w:tc>
-          <w:tcPr>
-            <w:tcW w:w="811" w:type="dxa"/>
-            <w:vAlign w:val="center"/>
-          </w:tcPr>
-          <w:p>
-            <w:r/>
-            <w:r>
-              <w:t>{{ n_pe_col_5 }}</w:t>
-            </w:r>
-          </w:p>
-        </w:tc>
-        <w:tc>
-          <w:tcPr>
-            <w:tcW w:w="812" w:type="dxa"/>
-            <w:vAlign w:val="center"/>
-          </w:tcPr>
-          <w:p>
-            <w:r/>
-            <w:r>
-              <w:t>{{ n_pe_col_6 }}</w:t>
-            </w:r>
-          </w:p>
-        </w:tc>
-        <w:tc>
-          <w:tcPr>
-            <w:tcW w:w="811" w:type="dxa"/>
-            <w:vAlign w:val="center"/>
-          </w:tcPr>
-          <w:p>
-            <w:r/>
-            <w:r>
-              <w:t>{{ n_pe_col_7 }}</w:t>
-            </w:r>
-          </w:p>
-        </w:tc>
-        <w:tc>
-          <w:tcPr>
-            <w:tcW w:w="812" w:type="dxa"/>
-            <w:vAlign w:val="center"/>
-          </w:tcPr>
-          <w:p>
-            <w:r/>
-            <w:r>
-              <w:t>{{ n_pe_col_8 }}</w:t>
-            </w:r>
-          </w:p>
-        </w:tc>
-      </w:tr>
-      <w:tr>
-        <w:trPr>
-          <w:trHeight w:val="283"/>
-        </w:trPr>
-        <w:tc>
-          <w:tcPr>
-            <w:tcW w:w="2524" w:type="dxa"/>
-            <w:vAlign w:val="center"/>
-          </w:tcPr>
-          <w:p>
-            <w:pPr>
-              <w:rPr>
-                <w:rFonts w:ascii="Arial" w:hAnsi="Arial" w:cs="Arial"/>
-                <w:lang w:val="en-US"/>
-              </w:rPr>
-            </w:pPr>
-            <w:r>
-              <w:rPr>
-                <w:rFonts w:ascii="Arial" w:hAnsi="Arial" w:cs="Arial"/>
-                <w:lang w:val="en-US"/>
-              </w:rPr>
-              <w:t>L1+N+PE</w:t>
-            </w:r>
-          </w:p>
-        </w:tc>
-        <w:tc>
-          <w:tcPr>
-            <w:tcW w:w="811" w:type="dxa"/>
-            <w:vAlign w:val="center"/>
-          </w:tcPr>
-          <w:p>
-            <w:r/>
-            <w:r>
-              <w:t>{{ l1_n_pe_col_1 }}</w:t>
-            </w:r>
-          </w:p>
-        </w:tc>
-        <w:tc>
-          <w:tcPr>
-            <w:tcW w:w="812" w:type="dxa"/>
-            <w:vAlign w:val="center"/>
-          </w:tcPr>
-          <w:p>
-            <w:r/>
-            <w:r>
-              <w:t>{{ l1_n_pe_col_2 }}</w:t>
-            </w:r>
-          </w:p>
-        </w:tc>
-        <w:tc>
-          <w:tcPr>
-            <w:tcW w:w="811" w:type="dxa"/>
-            <w:vAlign w:val="center"/>
-          </w:tcPr>
-          <w:p>
-            <w:r/>
-            <w:r>
-              <w:t>{{ l1_n_pe_col_3 }}</w:t>
-            </w:r>
-          </w:p>
-        </w:tc>
-        <w:tc>
-          <w:tcPr>
-            <w:tcW w:w="812" w:type="dxa"/>
-            <w:vAlign w:val="center"/>
-          </w:tcPr>
-          <w:p>
-            <w:r/>
-            <w:r>
-              <w:t>{{ l1_n_pe_col_4 }}</w:t>
-            </w:r>
-          </w:p>
-        </w:tc>
-        <w:tc>
-          <w:tcPr>
-            <w:tcW w:w="811" w:type="dxa"/>
-            <w:vAlign w:val="center"/>
-          </w:tcPr>
-          <w:p>
-            <w:r/>
-            <w:r>
-              <w:t>{{ l1_n_pe_col_5 }}</w:t>
-            </w:r>
-          </w:p>
-        </w:tc>
-        <w:tc>
-          <w:tcPr>
-            <w:tcW w:w="812" w:type="dxa"/>
-            <w:vAlign w:val="center"/>
-          </w:tcPr>
-          <w:p>
-            <w:r/>
-            <w:r>
-              <w:t>{{ l1_n_pe_col_6 }}</w:t>
-            </w:r>
-          </w:p>
-        </w:tc>
-        <w:tc>
-          <w:tcPr>
-            <w:tcW w:w="811" w:type="dxa"/>
-            <w:vAlign w:val="center"/>
-          </w:tcPr>
-          <w:p>
-            <w:r/>
-            <w:r>
-              <w:t>{{ l1_n_pe_col_7 }}</w:t>
-            </w:r>
-          </w:p>
-        </w:tc>
-        <w:tc>
-          <w:tcPr>
-            <w:tcW w:w="812" w:type="dxa"/>
-            <w:vAlign w:val="center"/>
-          </w:tcPr>
-          <w:p>
-            <w:r/>
-            <w:r>
-              <w:t>{{ l1_n_pe_col_8 }}</w:t>
-            </w:r>
-          </w:p>
-        </w:tc>
-      </w:tr>
-    </w:tbl>
     <w:p>
       <w:pPr>
         <w:spacing w:after="0"/>
@@ -3362,615 +2290,6 @@
         </w:rPr>
       </w:pPr>
     </w:p>
-    <w:tbl>
-      <w:tblPr>
-        <w:tblStyle w:val="TableGrid"/>
-        <w:tblW w:w="0" w:type="auto"/>
-        <w:tblLook w:val="04A0" w:firstRow="1" w:lastRow="0" w:firstColumn="1" w:lastColumn="0" w:noHBand="0" w:noVBand="1"/>
-      </w:tblPr>
-      <w:tblGrid>
-        <w:gridCol w:w="2453"/>
-        <w:gridCol w:w="820"/>
-        <w:gridCol w:w="820"/>
-        <w:gridCol w:w="821"/>
-        <w:gridCol w:w="820"/>
-        <w:gridCol w:w="820"/>
-        <w:gridCol w:w="821"/>
-        <w:gridCol w:w="820"/>
-        <w:gridCol w:w="821"/>
-      </w:tblGrid>
-      <w:tr>
-        <w:trPr>
-          <w:trHeight w:val="283"/>
-        </w:trPr>
-        <w:tc>
-          <w:tcPr>
-            <w:tcW w:w="2453" w:type="dxa"/>
-            <w:vMerge w:val="restart"/>
-          </w:tcPr>
-          <w:p>
-            <w:pPr>
-              <w:jc w:val="center"/>
-              <w:rPr>
-                <w:rFonts w:ascii="Arial" w:hAnsi="Arial" w:cs="Arial"/>
-                <w:b/>
-                <w:bCs/>
-                <w:lang w:val="en-US"/>
-              </w:rPr>
-            </w:pPr>
-            <w:r>
-              <w:rPr>
-                <w:rFonts w:ascii="Arial" w:hAnsi="Arial" w:cs="Arial"/>
-                <w:b/>
-                <w:bCs/>
-                <w:lang w:val="en-US"/>
-              </w:rPr>
-              <w:t>Signal Lines</w:t>
-            </w:r>
-          </w:p>
-          <w:p>
-            <w:pPr>
-              <w:jc w:val="center"/>
-              <w:rPr>
-                <w:rFonts w:ascii="Arial" w:hAnsi="Arial" w:cs="Arial"/>
-                <w:b/>
-                <w:bCs/>
-                <w:lang w:val="en-US"/>
-              </w:rPr>
-            </w:pPr>
-            <w:r>
-              <w:rPr>
-                <w:rFonts w:ascii="Arial" w:hAnsi="Arial" w:cs="Arial"/>
-                <w:b/>
-                <w:bCs/>
-                <w:lang w:val="en-US"/>
-              </w:rPr>
-              <w:t>(e.g., RS 232, RJ45)</w:t>
-            </w:r>
-          </w:p>
-        </w:tc>
-        <w:tc>
-          <w:tcPr>
-            <w:tcW w:w="6563" w:type="dxa"/>
-            <w:gridSpan w:val="8"/>
-          </w:tcPr>
-          <w:p>
-            <w:pPr>
-              <w:jc w:val="center"/>
-              <w:rPr>
-                <w:rFonts w:ascii="Arial" w:hAnsi="Arial" w:cs="Arial"/>
-                <w:b/>
-                <w:bCs/>
-                <w:lang w:val="en-US"/>
-              </w:rPr>
-            </w:pPr>
-            <w:r>
-              <w:rPr>
-                <w:rFonts w:ascii="Arial" w:hAnsi="Arial" w:cs="Arial"/>
-                <w:b/>
-                <w:bCs/>
-                <w:lang w:val="en-US"/>
-              </w:rPr>
-              <w:t>Test Level (kV)</w:t>
-            </w:r>
-          </w:p>
-        </w:tc>
-      </w:tr>
-      <w:tr>
-        <w:trPr>
-          <w:trHeight w:val="283"/>
-        </w:trPr>
-        <w:tc>
-          <w:tcPr>
-            <w:tcW w:w="2453" w:type="dxa"/>
-            <w:vMerge/>
-          </w:tcPr>
-          <w:p>
-            <w:pPr>
-              <w:jc w:val="center"/>
-              <w:rPr>
-                <w:rFonts w:ascii="Arial" w:hAnsi="Arial" w:cs="Arial"/>
-                <w:b/>
-                <w:bCs/>
-                <w:lang w:val="en-US"/>
-              </w:rPr>
-            </w:pPr>
-          </w:p>
-        </w:tc>
-        <w:tc>
-          <w:tcPr>
-            <w:tcW w:w="820" w:type="dxa"/>
-          </w:tcPr>
-          <w:p>
-            <w:pPr>
-              <w:jc w:val="center"/>
-              <w:rPr>
-                <w:rFonts w:ascii="Arial" w:hAnsi="Arial" w:cs="Arial"/>
-                <w:b/>
-                <w:bCs/>
-                <w:lang w:val="en-US"/>
-              </w:rPr>
-            </w:pPr>
-            <w:r>
-              <w:rPr>
-                <w:rFonts w:ascii="Arial" w:hAnsi="Arial" w:cs="Arial"/>
-                <w:b/>
-                <w:bCs/>
-                <w:lang w:val="en-US"/>
-              </w:rPr>
-              <w:t>+0.25</w:t>
-            </w:r>
-          </w:p>
-        </w:tc>
-        <w:tc>
-          <w:tcPr>
-            <w:tcW w:w="820" w:type="dxa"/>
-          </w:tcPr>
-          <w:p>
-            <w:r/>
-            <w:r>
-              <w:t>{{ signal_lines_0_25_col_2 }}</w:t>
-            </w:r>
-          </w:p>
-        </w:tc>
-        <w:tc>
-          <w:tcPr>
-            <w:tcW w:w="821" w:type="dxa"/>
-          </w:tcPr>
-          <w:p>
-            <w:r/>
-            <w:r>
-              <w:t>{{ signal_lines_0_25_col_3 }}</w:t>
-            </w:r>
-          </w:p>
-        </w:tc>
-        <w:tc>
-          <w:tcPr>
-            <w:tcW w:w="820" w:type="dxa"/>
-          </w:tcPr>
-          <w:p>
-            <w:r/>
-            <w:r>
-              <w:t>{{ signal_lines_0_25_col_4 }}</w:t>
-            </w:r>
-          </w:p>
-        </w:tc>
-        <w:tc>
-          <w:tcPr>
-            <w:tcW w:w="820" w:type="dxa"/>
-          </w:tcPr>
-          <w:p>
-            <w:r/>
-            <w:r>
-              <w:t>{{ signal_lines_0_25_col_5 }}</w:t>
-            </w:r>
-          </w:p>
-        </w:tc>
-        <w:tc>
-          <w:tcPr>
-            <w:tcW w:w="821" w:type="dxa"/>
-          </w:tcPr>
-          <w:p>
-            <w:r/>
-            <w:r>
-              <w:t>{{ signal_lines_0_25_col_6 }}</w:t>
-            </w:r>
-          </w:p>
-        </w:tc>
-        <w:tc>
-          <w:tcPr>
-            <w:tcW w:w="820" w:type="dxa"/>
-          </w:tcPr>
-          <w:p>
-            <w:r/>
-            <w:r>
-              <w:t>{{ signal_lines_0_25_col_7 }}</w:t>
-            </w:r>
-          </w:p>
-        </w:tc>
-        <w:tc>
-          <w:tcPr>
-            <w:tcW w:w="821" w:type="dxa"/>
-          </w:tcPr>
-          <w:p>
-            <w:r/>
-            <w:r>
-              <w:t>{{ signal_lines_0_25_col_8 }}</w:t>
-            </w:r>
-          </w:p>
-        </w:tc>
-      </w:tr>
-      <w:tr>
-        <w:trPr>
-          <w:trHeight w:val="283"/>
-        </w:trPr>
-        <w:tc>
-          <w:tcPr>
-            <w:tcW w:w="2453" w:type="dxa"/>
-          </w:tcPr>
-          <w:p>
-            <w:pPr>
-              <w:rPr>
-                <w:rFonts w:ascii="Arial" w:hAnsi="Arial" w:cs="Arial"/>
-                <w:lang w:val="en-US"/>
-              </w:rPr>
-            </w:pPr>
-          </w:p>
-        </w:tc>
-        <w:tc>
-          <w:tcPr>
-            <w:tcW w:w="820" w:type="dxa"/>
-          </w:tcPr>
-          <w:p>
-            <w:pPr>
-              <w:jc w:val="center"/>
-              <w:rPr>
-                <w:rFonts w:ascii="Arial" w:hAnsi="Arial" w:cs="Arial"/>
-                <w:lang w:val="en-US"/>
-              </w:rPr>
-            </w:pPr>
-          </w:p>
-        </w:tc>
-        <w:tc>
-          <w:tcPr>
-            <w:tcW w:w="820" w:type="dxa"/>
-          </w:tcPr>
-          <w:p>
-            <w:pPr>
-              <w:jc w:val="center"/>
-              <w:rPr>
-                <w:rFonts w:ascii="Arial" w:hAnsi="Arial" w:cs="Arial"/>
-                <w:lang w:val="en-US"/>
-              </w:rPr>
-            </w:pPr>
-          </w:p>
-        </w:tc>
-        <w:tc>
-          <w:tcPr>
-            <w:tcW w:w="821" w:type="dxa"/>
-          </w:tcPr>
-          <w:p>
-            <w:pPr>
-              <w:jc w:val="center"/>
-              <w:rPr>
-                <w:rFonts w:ascii="Arial" w:hAnsi="Arial" w:cs="Arial"/>
-                <w:lang w:val="en-US"/>
-              </w:rPr>
-            </w:pPr>
-          </w:p>
-        </w:tc>
-        <w:tc>
-          <w:tcPr>
-            <w:tcW w:w="820" w:type="dxa"/>
-          </w:tcPr>
-          <w:p>
-            <w:pPr>
-              <w:jc w:val="center"/>
-              <w:rPr>
-                <w:rFonts w:ascii="Arial" w:hAnsi="Arial" w:cs="Arial"/>
-                <w:lang w:val="en-US"/>
-              </w:rPr>
-            </w:pPr>
-          </w:p>
-        </w:tc>
-        <w:tc>
-          <w:tcPr>
-            <w:tcW w:w="820" w:type="dxa"/>
-          </w:tcPr>
-          <w:p>
-            <w:pPr>
-              <w:jc w:val="center"/>
-              <w:rPr>
-                <w:rFonts w:ascii="Arial" w:hAnsi="Arial" w:cs="Arial"/>
-                <w:lang w:val="en-US"/>
-              </w:rPr>
-            </w:pPr>
-          </w:p>
-        </w:tc>
-        <w:tc>
-          <w:tcPr>
-            <w:tcW w:w="821" w:type="dxa"/>
-          </w:tcPr>
-          <w:p>
-            <w:pPr>
-              <w:jc w:val="center"/>
-              <w:rPr>
-                <w:rFonts w:ascii="Arial" w:hAnsi="Arial" w:cs="Arial"/>
-                <w:lang w:val="en-US"/>
-              </w:rPr>
-            </w:pPr>
-          </w:p>
-        </w:tc>
-        <w:tc>
-          <w:tcPr>
-            <w:tcW w:w="820" w:type="dxa"/>
-          </w:tcPr>
-          <w:p>
-            <w:pPr>
-              <w:jc w:val="center"/>
-              <w:rPr>
-                <w:rFonts w:ascii="Arial" w:hAnsi="Arial" w:cs="Arial"/>
-                <w:lang w:val="en-US"/>
-              </w:rPr>
-            </w:pPr>
-          </w:p>
-        </w:tc>
-        <w:tc>
-          <w:tcPr>
-            <w:tcW w:w="821" w:type="dxa"/>
-          </w:tcPr>
-          <w:p>
-            <w:pPr>
-              <w:jc w:val="center"/>
-              <w:rPr>
-                <w:rFonts w:ascii="Arial" w:hAnsi="Arial" w:cs="Arial"/>
-                <w:lang w:val="en-US"/>
-              </w:rPr>
-            </w:pPr>
-          </w:p>
-        </w:tc>
-      </w:tr>
-      <w:tr>
-        <w:trPr>
-          <w:trHeight w:val="283"/>
-        </w:trPr>
-        <w:tc>
-          <w:tcPr>
-            <w:tcW w:w="2453" w:type="dxa"/>
-          </w:tcPr>
-          <w:p>
-            <w:pPr>
-              <w:rPr>
-                <w:rFonts w:ascii="Arial" w:hAnsi="Arial" w:cs="Arial"/>
-                <w:lang w:val="en-US"/>
-              </w:rPr>
-            </w:pPr>
-          </w:p>
-        </w:tc>
-        <w:tc>
-          <w:tcPr>
-            <w:tcW w:w="820" w:type="dxa"/>
-          </w:tcPr>
-          <w:p>
-            <w:pPr>
-              <w:jc w:val="center"/>
-              <w:rPr>
-                <w:rFonts w:ascii="Arial" w:hAnsi="Arial" w:cs="Arial"/>
-                <w:lang w:val="en-US"/>
-              </w:rPr>
-            </w:pPr>
-          </w:p>
-        </w:tc>
-        <w:tc>
-          <w:tcPr>
-            <w:tcW w:w="820" w:type="dxa"/>
-          </w:tcPr>
-          <w:p>
-            <w:pPr>
-              <w:jc w:val="center"/>
-              <w:rPr>
-                <w:rFonts w:ascii="Arial" w:hAnsi="Arial" w:cs="Arial"/>
-                <w:lang w:val="en-US"/>
-              </w:rPr>
-            </w:pPr>
-          </w:p>
-        </w:tc>
-        <w:tc>
-          <w:tcPr>
-            <w:tcW w:w="821" w:type="dxa"/>
-          </w:tcPr>
-          <w:p>
-            <w:pPr>
-              <w:jc w:val="center"/>
-              <w:rPr>
-                <w:rFonts w:ascii="Arial" w:hAnsi="Arial" w:cs="Arial"/>
-                <w:lang w:val="en-US"/>
-              </w:rPr>
-            </w:pPr>
-          </w:p>
-        </w:tc>
-        <w:tc>
-          <w:tcPr>
-            <w:tcW w:w="820" w:type="dxa"/>
-          </w:tcPr>
-          <w:p>
-            <w:pPr>
-              <w:jc w:val="center"/>
-              <w:rPr>
-                <w:rFonts w:ascii="Arial" w:hAnsi="Arial" w:cs="Arial"/>
-                <w:lang w:val="en-US"/>
-              </w:rPr>
-            </w:pPr>
-          </w:p>
-        </w:tc>
-        <w:tc>
-          <w:tcPr>
-            <w:tcW w:w="820" w:type="dxa"/>
-          </w:tcPr>
-          <w:p>
-            <w:pPr>
-              <w:jc w:val="center"/>
-              <w:rPr>
-                <w:rFonts w:ascii="Arial" w:hAnsi="Arial" w:cs="Arial"/>
-                <w:lang w:val="en-US"/>
-              </w:rPr>
-            </w:pPr>
-          </w:p>
-        </w:tc>
-        <w:tc>
-          <w:tcPr>
-            <w:tcW w:w="821" w:type="dxa"/>
-          </w:tcPr>
-          <w:p>
-            <w:pPr>
-              <w:jc w:val="center"/>
-              <w:rPr>
-                <w:rFonts w:ascii="Arial" w:hAnsi="Arial" w:cs="Arial"/>
-                <w:lang w:val="en-US"/>
-              </w:rPr>
-            </w:pPr>
-          </w:p>
-        </w:tc>
-        <w:tc>
-          <w:tcPr>
-            <w:tcW w:w="820" w:type="dxa"/>
-          </w:tcPr>
-          <w:p>
-            <w:pPr>
-              <w:jc w:val="center"/>
-              <w:rPr>
-                <w:rFonts w:ascii="Arial" w:hAnsi="Arial" w:cs="Arial"/>
-                <w:lang w:val="en-US"/>
-              </w:rPr>
-            </w:pPr>
-          </w:p>
-        </w:tc>
-        <w:tc>
-          <w:tcPr>
-            <w:tcW w:w="821" w:type="dxa"/>
-          </w:tcPr>
-          <w:p>
-            <w:pPr>
-              <w:jc w:val="center"/>
-              <w:rPr>
-                <w:rFonts w:ascii="Arial" w:hAnsi="Arial" w:cs="Arial"/>
-                <w:lang w:val="en-US"/>
-              </w:rPr>
-            </w:pPr>
-          </w:p>
-        </w:tc>
-      </w:tr>
-      <w:tr>
-        <w:trPr>
-          <w:trHeight w:val="283"/>
-        </w:trPr>
-        <w:tc>
-          <w:tcPr>
-            <w:tcW w:w="2453" w:type="dxa"/>
-          </w:tcPr>
-          <w:p>
-            <w:pPr>
-              <w:rPr>
-                <w:rFonts w:ascii="Arial" w:hAnsi="Arial" w:cs="Arial"/>
-                <w:lang w:val="en-US"/>
-              </w:rPr>
-            </w:pPr>
-          </w:p>
-        </w:tc>
-        <w:tc>
-          <w:tcPr>
-            <w:tcW w:w="820" w:type="dxa"/>
-          </w:tcPr>
-          <w:p>
-            <w:pPr>
-              <w:jc w:val="center"/>
-              <w:rPr>
-                <w:rFonts w:ascii="Arial" w:hAnsi="Arial" w:cs="Arial"/>
-                <w:lang w:val="en-US"/>
-              </w:rPr>
-            </w:pPr>
-          </w:p>
-        </w:tc>
-        <w:tc>
-          <w:tcPr>
-            <w:tcW w:w="820" w:type="dxa"/>
-          </w:tcPr>
-          <w:p>
-            <w:pPr>
-              <w:jc w:val="center"/>
-              <w:rPr>
-                <w:rFonts w:ascii="Arial" w:hAnsi="Arial" w:cs="Arial"/>
-                <w:lang w:val="en-US"/>
-              </w:rPr>
-            </w:pPr>
-          </w:p>
-        </w:tc>
-        <w:tc>
-          <w:tcPr>
-            <w:tcW w:w="821" w:type="dxa"/>
-          </w:tcPr>
-          <w:p>
-            <w:pPr>
-              <w:jc w:val="center"/>
-              <w:rPr>
-                <w:rFonts w:ascii="Arial" w:hAnsi="Arial" w:cs="Arial"/>
-                <w:lang w:val="en-US"/>
-              </w:rPr>
-            </w:pPr>
-          </w:p>
-        </w:tc>
-        <w:tc>
-          <w:tcPr>
-            <w:tcW w:w="820" w:type="dxa"/>
-          </w:tcPr>
-          <w:p>
-            <w:pPr>
-              <w:jc w:val="center"/>
-              <w:rPr>
-                <w:rFonts w:ascii="Arial" w:hAnsi="Arial" w:cs="Arial"/>
-                <w:lang w:val="en-US"/>
-              </w:rPr>
-            </w:pPr>
-          </w:p>
-        </w:tc>
-        <w:tc>
-          <w:tcPr>
-            <w:tcW w:w="820" w:type="dxa"/>
-          </w:tcPr>
-          <w:p>
-            <w:pPr>
-              <w:jc w:val="center"/>
-              <w:rPr>
-                <w:rFonts w:ascii="Arial" w:hAnsi="Arial" w:cs="Arial"/>
-                <w:lang w:val="en-US"/>
-              </w:rPr>
-            </w:pPr>
-          </w:p>
-        </w:tc>
-        <w:tc>
-          <w:tcPr>
-            <w:tcW w:w="821" w:type="dxa"/>
-          </w:tcPr>
-          <w:p>
-            <w:pPr>
-              <w:jc w:val="center"/>
-              <w:rPr>
-                <w:rFonts w:ascii="Arial" w:hAnsi="Arial" w:cs="Arial"/>
-                <w:lang w:val="en-US"/>
-              </w:rPr>
-            </w:pPr>
-          </w:p>
-        </w:tc>
-        <w:tc>
-          <w:tcPr>
-            <w:tcW w:w="820" w:type="dxa"/>
-          </w:tcPr>
-          <w:p>
-            <w:pPr>
-              <w:jc w:val="center"/>
-              <w:rPr>
-                <w:rFonts w:ascii="Arial" w:hAnsi="Arial" w:cs="Arial"/>
-                <w:lang w:val="en-US"/>
-              </w:rPr>
-            </w:pPr>
-          </w:p>
-        </w:tc>
-        <w:tc>
-          <w:tcPr>
-            <w:tcW w:w="821" w:type="dxa"/>
-          </w:tcPr>
-          <w:p>
-            <w:pPr>
-              <w:jc w:val="center"/>
-              <w:rPr>
-                <w:rFonts w:ascii="Arial" w:hAnsi="Arial" w:cs="Arial"/>
-                <w:lang w:val="en-US"/>
-              </w:rPr>
-            </w:pPr>
-          </w:p>
-        </w:tc>
-      </w:tr>
-    </w:tbl>
     <w:p>
       <w:pPr>
         <w:spacing w:before="120"/>

</xml_diff>